<commit_message>
Till now app is working finr except learn tab and why learn tab is there need to understand
</commit_message>
<xml_diff>
--- a/mathvese_master_project_rentry_prompt.docx
+++ b/mathvese_master_project_rentry_prompt.docx
@@ -408,6 +408,45 @@
       </w:r>
     </w:p>
     <w:p/>
+    <w:p/>
+    <w:p>
+      <w:r>
+        <w:t>| Plan     | Features                             |</w:t>
+      </w:r>
+    </w:p>
+    <w:p>
+      <w:r>
+        <w:t>| -------- | ------------------------------------ |</w:t>
+      </w:r>
+    </w:p>
+    <w:p>
+      <w:r>
+        <w:t>| Free     | basic CBSE practice                  |</w:t>
+      </w:r>
+    </w:p>
+    <w:p>
+      <w:r>
+        <w:t>| CBSE Pro | full syllabus + voice                |</w:t>
+      </w:r>
+    </w:p>
+    <w:p>
+      <w:r>
+        <w:t>| JEE Lite | practice + adaptive                  |</w:t>
+      </w:r>
+    </w:p>
+    <w:p>
+      <w:r>
+        <w:t xml:space="preserve">| JEE </w:t>
+      </w:r>
+      <w:proofErr w:type="gramStart"/>
+      <w:r>
+        <w:t>Pro  |</w:t>
+      </w:r>
+      <w:proofErr w:type="gramEnd"/>
+      <w:r>
+        <w:t xml:space="preserve"> full engine + analytics + speed mode |</w:t>
+      </w:r>
+    </w:p>
     <w:sectPr>
       <w:pgSz w:w="11906" w:h="16838"/>
       <w:pgMar w:top="1440" w:right="1440" w:bottom="1440" w:left="1440" w:header="708" w:footer="708" w:gutter="0"/>

</xml_diff>